<commit_message>
docs: Agregar descripcion inicial del proyecto
</commit_message>
<xml_diff>
--- a/README.md.docx
+++ b/README.md.docx
@@ -4,108 +4,66 @@
   <w:body>
     <w:p>
       <w:pPr>
-        <w:rPr>
-          <w:lang w:val="es-ES"/>
-        </w:rPr>
+        <w:ind w:left="708"/>
       </w:pPr>
-      <w:bookmarkStart w:id="0" w:name="_GoBack"/>
-      <w:bookmarkEnd w:id="0"/>
       <w:r>
-        <w:rPr>
-          <w:lang w:val="es-ES"/>
-        </w:rPr>
-        <w:t xml:space="preserve">Lista de tareas </w:t>
+        <w:t># Lista de tareas</w:t>
       </w:r>
     </w:p>
     <w:p>
       <w:pPr>
-        <w:rPr>
-          <w:lang w:val="es-ES"/>
-        </w:rPr>
+        <w:ind w:left="708"/>
       </w:pPr>
-      <w:proofErr w:type="spellStart"/>
       <w:r>
-        <w:rPr>
-          <w:lang w:val="es-ES"/>
-        </w:rPr>
-        <w:t>Fasnfpas</w:t>
+        <w:t>## Descripción</w:t>
       </w:r>
-      <w:proofErr w:type="spellEnd"/>
     </w:p>
     <w:p>
       <w:pPr>
-        <w:rPr>
-          <w:lang w:val="es-ES"/>
-        </w:rPr>
+        <w:ind w:left="708"/>
       </w:pPr>
-      <w:proofErr w:type="spellStart"/>
       <w:r>
-        <w:rPr>
-          <w:lang w:val="es-ES"/>
-        </w:rPr>
-        <w:t>Fasfsagas</w:t>
+        <w:t>Proyecto colaborativo para gestionar tareas pendientes.</w:t>
       </w:r>
-      <w:proofErr w:type="spellEnd"/>
     </w:p>
     <w:p>
       <w:pPr>
-        <w:rPr>
-          <w:lang w:val="es-ES"/>
-        </w:rPr>
+        <w:ind w:left="708"/>
       </w:pPr>
-      <w:proofErr w:type="spellStart"/>
       <w:r>
-        <w:rPr>
-          <w:lang w:val="es-ES"/>
-        </w:rPr>
-        <w:t>Aasfas</w:t>
+        <w:t>## Funcionalidades</w:t>
       </w:r>
-      <w:proofErr w:type="spellEnd"/>
     </w:p>
     <w:p>
       <w:pPr>
-        <w:rPr>
-          <w:lang w:val="es-ES"/>
-        </w:rPr>
+        <w:ind w:left="708"/>
       </w:pPr>
+      <w:r>
+        <w:t>- Registrar tareas.</w:t>
+      </w:r>
     </w:p>
     <w:p>
       <w:pPr>
-        <w:rPr>
-          <w:lang w:val="es-ES"/>
-        </w:rPr>
+        <w:ind w:left="708"/>
       </w:pPr>
-      <w:proofErr w:type="spellStart"/>
       <w:r>
-        <w:rPr>
-          <w:lang w:val="es-ES"/>
-        </w:rPr>
-        <w:t>Hahaha</w:t>
+        <w:t>- Mostrar tareas.</w:t>
       </w:r>
-      <w:proofErr w:type="spellEnd"/>
     </w:p>
     <w:p>
       <w:pPr>
-        <w:rPr>
-          <w:lang w:val="es-ES"/>
-        </w:rPr>
+        <w:ind w:left="708"/>
       </w:pPr>
-      <w:proofErr w:type="spellStart"/>
       <w:r>
-        <w:rPr>
-          <w:lang w:val="es-ES"/>
-        </w:rPr>
-        <w:t>Xd</w:t>
+        <w:t>- Marcar tareas como completadas.</w:t>
       </w:r>
-      <w:proofErr w:type="spellEnd"/>
+      <w:r>
+        <w:t xml:space="preserve"> ahh</w:t>
+      </w:r>
+      <w:bookmarkStart w:id="0" w:name="_GoBack"/>
+      <w:bookmarkEnd w:id="0"/>
     </w:p>
-    <w:p>
-      <w:pPr>
-        <w:rPr>
-          <w:lang w:val="es-ES"/>
-        </w:rPr>
-      </w:pPr>
-    </w:p>
+    <w:p/>
     <w:sectPr>
       <w:pgSz w:w="11906" w:h="16838"/>
       <w:pgMar w:top="1417" w:right="1701" w:bottom="1417" w:left="1701" w:header="708" w:footer="708" w:gutter="0"/>
@@ -509,6 +467,15 @@
   <w:style w:type="paragraph" w:default="1" w:styleId="Normal">
     <w:name w:val="Normal"/>
     <w:qFormat/>
+    <w:rsid w:val="00582741"/>
+    <w:pPr>
+      <w:spacing w:line="360" w:lineRule="auto"/>
+      <w:jc w:val="both"/>
+    </w:pPr>
+    <w:rPr>
+      <w:rFonts w:eastAsia="Times New Roman"/>
+      <w:lang w:val="es-ES" w:eastAsia="es-ES"/>
+    </w:rPr>
   </w:style>
   <w:style w:type="character" w:default="1" w:styleId="Fuentedeprrafopredeter">
     <w:name w:val="Default Paragraph Font"/>

</xml_diff>